<commit_message>
QA reports for release-0.14.0
Signed-off-by: Likhitha R L <likhitha.rl@technoforte.co.in>
</commit_message>
<xml_diff>
--- a/inji-certify/0.14.0/Injicertify 0.14.0 Functional Test Report.docx
+++ b/inji-certify/0.14.0/Injicertify 0.14.0 Functional Test Report.docx
@@ -26,12 +26,12 @@
             <wp:extent cx="3371850" cy="2343150"/>
             <wp:effectExtent b="0" l="0" r="0" t="0"/>
             <wp:wrapSquare wrapText="bothSides" distB="91440" distT="91440" distL="114300" distR="114300"/>
-            <wp:docPr id="1919398206" name="image2.png"/>
+            <wp:docPr id="1919398206" name="image1.png"/>
             <a:graphic>
               <a:graphicData uri="http://schemas.openxmlformats.org/drawingml/2006/picture">
                 <pic:pic>
                   <pic:nvPicPr>
-                    <pic:cNvPr id="0" name="image2.png"/>
+                    <pic:cNvPr id="0" name="image1.png"/>
                     <pic:cNvPicPr preferRelativeResize="0"/>
                   </pic:nvPicPr>
                   <pic:blipFill>
@@ -1853,7 +1853,7 @@
     </w:p>
     <w:sdt>
       <w:sdtPr>
-        <w:id w:val="-852810943"/>
+        <w:id w:val="-1933171856"/>
         <w:docPartObj>
           <w:docPartGallery w:val="Table of Contents"/>
           <w:docPartUnique w:val="1"/>
@@ -2391,7 +2391,7 @@
               </w:rPr>
               <w:t xml:space="preserve">Defect Metrics</w:t>
               <w:tab/>
-              <w:t xml:space="preserve">8</w:t>
+              <w:t xml:space="preserve">9</w:t>
             </w:r>
           </w:hyperlink>
           <w:r>
@@ -2445,7 +2445,7 @@
               </w:rPr>
               <w:t xml:space="preserve">Defect Metrics for the Release 0.14.0</w:t>
               <w:tab/>
-              <w:t xml:space="preserve">8</w:t>
+              <w:t xml:space="preserve">9</w:t>
             </w:r>
           </w:hyperlink>
           <w:r>
@@ -6223,7 +6223,7 @@
       <w:tr>
         <w:trPr>
           <w:cantSplit w:val="0"/>
-          <w:trHeight w:val="672" w:hRule="atLeast"/>
+          <w:trHeight w:val="420" w:hRule="atLeast"/>
           <w:tblHeader w:val="1"/>
         </w:trPr>
         <w:tc>
@@ -6550,7 +6550,7 @@
                 <w:szCs w:val="24"/>
                 <w:rtl w:val="0"/>
               </w:rPr>
-              <w:t xml:space="preserve">878</w:t>
+              <w:t xml:space="preserve">880</w:t>
             </w:r>
             <w:r>
               <w:rPr>
@@ -6821,25 +6821,28 @@
         <w:jc w:val="left"/>
         <w:rPr>
           <w:rFonts w:ascii="Calibri" w:cs="Calibri" w:eastAsia="Calibri" w:hAnsi="Calibri"/>
-          <w:sz w:val="24"/>
-          <w:szCs w:val="24"/>
         </w:rPr>
       </w:pPr>
       <w:r>
         <w:rPr>
           <w:rFonts w:ascii="Calibri" w:cs="Calibri" w:eastAsia="Calibri" w:hAnsi="Calibri"/>
-          <w:color w:val="000000"/>
         </w:rPr>
         <w:drawing>
-          <wp:inline distB="0" distT="0" distL="0" distR="0">
-            <wp:extent cx="6346755" cy="2806436"/>
+          <wp:inline distB="114300" distT="114300" distL="114300" distR="114300">
+            <wp:extent cx="6400800" cy="3367088"/>
             <wp:effectExtent b="0" l="0" r="0" t="0"/>
-            <wp:docPr id="1919398208" name="image3.png"/>
+            <wp:docPr descr="Chart" id="1919398208" name="image3.png">
+              <a:extLst>
+                <a:ext uri="http://customooxmlschemas.google.com/">
+                  <go:docsCustomData xmlns:go="http://customooxmlschemas.google.com/" roundtripId="0"/>
+                </a:ext>
+              </a:extLst>
+            </wp:docPr>
             <a:graphic>
               <a:graphicData uri="http://schemas.openxmlformats.org/drawingml/2006/picture">
                 <pic:pic>
                   <pic:nvPicPr>
-                    <pic:cNvPr id="0" name="image3.png"/>
+                    <pic:cNvPr descr="Chart" id="0" name="image3.png"/>
                     <pic:cNvPicPr preferRelativeResize="0"/>
                   </pic:nvPicPr>
                   <pic:blipFill>
@@ -6852,7 +6855,7 @@
                   <pic:spPr>
                     <a:xfrm>
                       <a:off x="0" y="0"/>
-                      <a:ext cx="6346755" cy="2806436"/>
+                      <a:ext cx="6400800" cy="3367088"/>
                     </a:xfrm>
                     <a:prstGeom prst="rect"/>
                     <a:ln/>
@@ -6871,24 +6874,16 @@
     </w:p>
     <w:p>
       <w:pPr>
+        <w:pStyle w:val="Heading2"/>
+        <w:spacing w:before="40" w:line="256" w:lineRule="auto"/>
+        <w:ind w:firstLine="432"/>
         <w:jc w:val="left"/>
         <w:rPr>
           <w:rFonts w:ascii="Calibri" w:cs="Calibri" w:eastAsia="Calibri" w:hAnsi="Calibri"/>
         </w:rPr>
       </w:pPr>
-      <w:r>
-        <w:rPr>
-          <w:rtl w:val="0"/>
-        </w:rPr>
-      </w:r>
-    </w:p>
-    <w:p>
-      <w:pPr>
-        <w:jc w:val="left"/>
-        <w:rPr>
-          <w:rFonts w:ascii="Calibri" w:cs="Calibri" w:eastAsia="Calibri" w:hAnsi="Calibri"/>
-        </w:rPr>
-      </w:pPr>
+      <w:bookmarkStart w:colFirst="0" w:colLast="0" w:name="_heading=h.mu4ymmwwfvb4" w:id="13"/>
+      <w:bookmarkEnd w:id="13"/>
       <w:r>
         <w:rPr>
           <w:rtl w:val="0"/>
@@ -6905,8 +6900,8 @@
           <w:rFonts w:ascii="Calibri" w:cs="Calibri" w:eastAsia="Calibri" w:hAnsi="Calibri"/>
         </w:rPr>
       </w:pPr>
-      <w:bookmarkStart w:colFirst="0" w:colLast="0" w:name="_heading=h.9mtnclzavp68" w:id="13"/>
-      <w:bookmarkEnd w:id="13"/>
+      <w:bookmarkStart w:colFirst="0" w:colLast="0" w:name="_heading=h.9mtnclzavp68" w:id="14"/>
+      <w:bookmarkEnd w:id="14"/>
       <w:r>
         <w:rPr>
           <w:rFonts w:ascii="Calibri" w:cs="Calibri" w:eastAsia="Calibri" w:hAnsi="Calibri"/>
@@ -8389,6 +8384,58 @@
     </w:p>
     <w:p>
       <w:pPr>
+        <w:jc w:val="left"/>
+        <w:rPr>
+          <w:rFonts w:ascii="Calibri" w:cs="Calibri" w:eastAsia="Calibri" w:hAnsi="Calibri"/>
+        </w:rPr>
+      </w:pPr>
+      <w:r>
+        <w:rPr>
+          <w:rtl w:val="0"/>
+        </w:rPr>
+      </w:r>
+    </w:p>
+    <w:p>
+      <w:pPr>
+        <w:jc w:val="left"/>
+        <w:rPr>
+          <w:rFonts w:ascii="Calibri" w:cs="Calibri" w:eastAsia="Calibri" w:hAnsi="Calibri"/>
+        </w:rPr>
+      </w:pPr>
+      <w:r>
+        <w:rPr>
+          <w:rtl w:val="0"/>
+        </w:rPr>
+      </w:r>
+    </w:p>
+    <w:p>
+      <w:pPr>
+        <w:jc w:val="left"/>
+        <w:rPr>
+          <w:rFonts w:ascii="Calibri" w:cs="Calibri" w:eastAsia="Calibri" w:hAnsi="Calibri"/>
+        </w:rPr>
+      </w:pPr>
+      <w:r>
+        <w:rPr>
+          <w:rtl w:val="0"/>
+        </w:rPr>
+      </w:r>
+    </w:p>
+    <w:p>
+      <w:pPr>
+        <w:jc w:val="left"/>
+        <w:rPr>
+          <w:rFonts w:ascii="Calibri" w:cs="Calibri" w:eastAsia="Calibri" w:hAnsi="Calibri"/>
+        </w:rPr>
+      </w:pPr>
+      <w:r>
+        <w:rPr>
+          <w:rtl w:val="0"/>
+        </w:rPr>
+      </w:r>
+    </w:p>
+    <w:p>
+      <w:pPr>
         <w:keepNext w:val="0"/>
         <w:keepLines w:val="0"/>
         <w:pageBreakBefore w:val="0"/>
@@ -10345,8 +10392,8 @@
           <w:rFonts w:ascii="Calibri" w:cs="Calibri" w:eastAsia="Calibri" w:hAnsi="Calibri"/>
         </w:rPr>
       </w:pPr>
-      <w:bookmarkStart w:colFirst="0" w:colLast="0" w:name="_heading=h.ykb1fkjgoozn" w:id="14"/>
-      <w:bookmarkEnd w:id="14"/>
+      <w:bookmarkStart w:colFirst="0" w:colLast="0" w:name="_heading=h.ykb1fkjgoozn" w:id="15"/>
+      <w:bookmarkEnd w:id="15"/>
       <w:r>
         <w:rPr>
           <w:rFonts w:ascii="Calibri" w:cs="Calibri" w:eastAsia="Calibri" w:hAnsi="Calibri"/>
@@ -10365,8 +10412,8 @@
           <w:rFonts w:ascii="Calibri" w:cs="Calibri" w:eastAsia="Calibri" w:hAnsi="Calibri"/>
         </w:rPr>
       </w:pPr>
-      <w:bookmarkStart w:colFirst="0" w:colLast="0" w:name="_heading=h.dl0u2zflqjz3" w:id="15"/>
-      <w:bookmarkEnd w:id="15"/>
+      <w:bookmarkStart w:colFirst="0" w:colLast="0" w:name="_heading=h.dl0u2zflqjz3" w:id="16"/>
+      <w:bookmarkEnd w:id="16"/>
       <w:r>
         <w:rPr>
           <w:rFonts w:ascii="Calibri" w:cs="Calibri" w:eastAsia="Calibri" w:hAnsi="Calibri"/>
@@ -10426,35 +10473,6 @@
           <w:rtl w:val="0"/>
         </w:rPr>
         <w:t xml:space="preserve">The following table depicts only the bugs which are found and not addressed in the current release. </w:t>
-      </w:r>
-    </w:p>
-    <w:p>
-      <w:pPr>
-        <w:keepNext w:val="0"/>
-        <w:keepLines w:val="0"/>
-        <w:pageBreakBefore w:val="0"/>
-        <w:widowControl w:val="1"/>
-        <w:pBdr>
-          <w:top w:space="0" w:sz="0" w:val="nil"/>
-          <w:left w:space="0" w:sz="0" w:val="nil"/>
-          <w:bottom w:space="0" w:sz="0" w:val="nil"/>
-          <w:right w:space="0" w:sz="0" w:val="nil"/>
-          <w:between w:space="0" w:sz="0" w:val="nil"/>
-        </w:pBdr>
-        <w:shd w:fill="auto" w:val="clear"/>
-        <w:spacing w:after="0" w:before="0" w:line="276" w:lineRule="auto"/>
-        <w:ind w:left="432" w:right="0" w:firstLine="288"/>
-        <w:jc w:val="left"/>
-        <w:rPr>
-          <w:rFonts w:ascii="Calibri" w:cs="Calibri" w:eastAsia="Calibri" w:hAnsi="Calibri"/>
-          <w:sz w:val="24"/>
-          <w:szCs w:val="24"/>
-        </w:rPr>
-      </w:pPr>
-      <w:r>
-        <w:rPr>
-          <w:rtl w:val="0"/>
-        </w:rPr>
       </w:r>
     </w:p>
     <w:p>
@@ -11354,8 +11372,8 @@
           <w:rFonts w:ascii="Calibri" w:cs="Calibri" w:eastAsia="Calibri" w:hAnsi="Calibri"/>
         </w:rPr>
       </w:pPr>
-      <w:bookmarkStart w:colFirst="0" w:colLast="0" w:name="_heading=h.xepgozr1tvig" w:id="16"/>
-      <w:bookmarkEnd w:id="16"/>
+      <w:bookmarkStart w:colFirst="0" w:colLast="0" w:name="_heading=h.xepgozr1tvig" w:id="17"/>
+      <w:bookmarkEnd w:id="17"/>
       <w:r>
         <w:rPr>
           <w:rFonts w:ascii="Calibri" w:cs="Calibri" w:eastAsia="Calibri" w:hAnsi="Calibri"/>
@@ -11550,7 +11568,7 @@
           <w:szCs w:val="24"/>
           <w:rtl w:val="0"/>
         </w:rPr>
-        <w:t xml:space="preserve">78</w:t>
+        <w:t xml:space="preserve">80</w:t>
       </w:r>
       <w:r>
         <w:rPr>
@@ -11704,30 +11722,11 @@
           <w:rFonts w:ascii="Calibri" w:cs="Calibri" w:eastAsia="Calibri" w:hAnsi="Calibri"/>
           <w:b w:val="1"/>
           <w:bCs w:val="1"/>
-          <w:i w:val="0"/>
-          <w:iCs w:val="0"/>
-          <w:smallCaps w:val="0"/>
-          <w:strike w:val="0"/>
-          <w:color w:val="000000"/>
           <w:sz w:val="24"/>
           <w:szCs w:val="24"/>
-          <w:u w:val="none"/>
-          <w:shd w:fill="auto" w:val="clear"/>
-          <w:vertAlign w:val="baseline"/>
-          <w:rtl w:val="0"/>
-        </w:rPr>
-        <w:t xml:space="preserve">2</w:t>
-      </w:r>
-      <w:r>
-        <w:rPr>
-          <w:rFonts w:ascii="Calibri" w:cs="Calibri" w:eastAsia="Calibri" w:hAnsi="Calibri"/>
-          <w:b w:val="1"/>
-          <w:bCs w:val="1"/>
-          <w:sz w:val="24"/>
-          <w:szCs w:val="24"/>
-          <w:rtl w:val="0"/>
-        </w:rPr>
-        <w:t xml:space="preserve">2</w:t>
+          <w:rtl w:val="0"/>
+        </w:rPr>
+        <w:t xml:space="preserve">18</w:t>
       </w:r>
       <w:r>
         <w:rPr>
@@ -11774,7 +11773,7 @@
           <w:szCs w:val="24"/>
           <w:rtl w:val="0"/>
         </w:rPr>
-        <w:t xml:space="preserve">18</w:t>
+        <w:t xml:space="preserve">14</w:t>
       </w:r>
       <w:r>
         <w:rPr>
@@ -11923,8 +11922,8 @@
           <w:rFonts w:ascii="Calibri" w:cs="Calibri" w:eastAsia="Calibri" w:hAnsi="Calibri"/>
         </w:rPr>
       </w:pPr>
-      <w:bookmarkStart w:colFirst="0" w:colLast="0" w:name="_heading=h.8x6p7qvgpknz" w:id="17"/>
-      <w:bookmarkEnd w:id="17"/>
+      <w:bookmarkStart w:colFirst="0" w:colLast="0" w:name="_heading=h.8x6p7qvgpknz" w:id="18"/>
+      <w:bookmarkEnd w:id="18"/>
       <w:r>
         <w:rPr>
           <w:rFonts w:ascii="Calibri" w:cs="Calibri" w:eastAsia="Calibri" w:hAnsi="Calibri"/>
@@ -12326,6 +12325,35 @@
           <w:rtl w:val="0"/>
         </w:rPr>
         <w:t xml:space="preserve"> The test environment remained stable throughout the execution cycle.</w:t>
+      </w:r>
+    </w:p>
+    <w:p>
+      <w:pPr>
+        <w:keepNext w:val="0"/>
+        <w:keepLines w:val="0"/>
+        <w:pageBreakBefore w:val="0"/>
+        <w:widowControl w:val="1"/>
+        <w:pBdr>
+          <w:top w:space="0" w:sz="0" w:val="nil"/>
+          <w:left w:space="0" w:sz="0" w:val="nil"/>
+          <w:bottom w:space="0" w:sz="0" w:val="nil"/>
+          <w:right w:space="0" w:sz="0" w:val="nil"/>
+          <w:between w:space="0" w:sz="0" w:val="nil"/>
+        </w:pBdr>
+        <w:shd w:fill="auto" w:val="clear"/>
+        <w:spacing w:after="200" w:before="0" w:line="240" w:lineRule="auto"/>
+        <w:ind w:left="720" w:right="0" w:firstLine="0"/>
+        <w:jc w:val="left"/>
+        <w:rPr>
+          <w:rFonts w:ascii="Calibri" w:cs="Calibri" w:eastAsia="Calibri" w:hAnsi="Calibri"/>
+          <w:sz w:val="24"/>
+          <w:szCs w:val="24"/>
+        </w:rPr>
+      </w:pPr>
+      <w:r>
+        <w:rPr>
+          <w:rtl w:val="0"/>
+        </w:rPr>
       </w:r>
     </w:p>
     <w:p>
@@ -12923,8 +12951,8 @@
           <w:rFonts w:ascii="Calibri" w:cs="Calibri" w:eastAsia="Calibri" w:hAnsi="Calibri"/>
         </w:rPr>
       </w:pPr>
-      <w:bookmarkStart w:colFirst="0" w:colLast="0" w:name="_heading=h.luajuw5y7jso" w:id="18"/>
-      <w:bookmarkEnd w:id="18"/>
+      <w:bookmarkStart w:colFirst="0" w:colLast="0" w:name="_heading=h.luajuw5y7jso" w:id="19"/>
+      <w:bookmarkEnd w:id="19"/>
       <w:r>
         <w:rPr>
           <w:rFonts w:ascii="Calibri" w:cs="Calibri" w:eastAsia="Calibri" w:hAnsi="Calibri"/>
@@ -12963,8 +12991,8 @@
           <w:rFonts w:ascii="Calibri" w:cs="Calibri" w:eastAsia="Calibri" w:hAnsi="Calibri"/>
         </w:rPr>
       </w:pPr>
-      <w:bookmarkStart w:colFirst="0" w:colLast="0" w:name="_heading=h.hmervno4rptv" w:id="19"/>
-      <w:bookmarkEnd w:id="19"/>
+      <w:bookmarkStart w:colFirst="0" w:colLast="0" w:name="_heading=h.hmervno4rptv" w:id="20"/>
+      <w:bookmarkEnd w:id="20"/>
       <w:r>
         <w:rPr>
           <w:rFonts w:ascii="Calibri" w:cs="Calibri" w:eastAsia="Calibri" w:hAnsi="Calibri"/>
@@ -13583,8 +13611,8 @@
           <w:szCs w:val="28"/>
         </w:rPr>
       </w:pPr>
-      <w:bookmarkStart w:colFirst="0" w:colLast="0" w:name="_heading=h.o2qfhfp2vxnc" w:id="20"/>
-      <w:bookmarkEnd w:id="20"/>
+      <w:bookmarkStart w:colFirst="0" w:colLast="0" w:name="_heading=h.o2qfhfp2vxnc" w:id="21"/>
+      <w:bookmarkEnd w:id="21"/>
       <w:r>
         <w:rPr>
           <w:rFonts w:ascii="Calibri" w:cs="Calibri" w:eastAsia="Calibri" w:hAnsi="Calibri"/>
@@ -15115,12 +15143,12 @@
           <wp:extent cx="742950" cy="336550"/>
           <wp:effectExtent b="0" l="0" r="0" t="0"/>
           <wp:wrapSquare wrapText="bothSides" distB="0" distT="0" distL="114300" distR="114300"/>
-          <wp:docPr id="1919398207" name="image1.png"/>
+          <wp:docPr id="1919398207" name="image2.png"/>
           <a:graphic>
             <a:graphicData uri="http://schemas.openxmlformats.org/drawingml/2006/picture">
               <pic:pic>
                 <pic:nvPicPr>
-                  <pic:cNvPr id="0" name="image1.png"/>
+                  <pic:cNvPr id="0" name="image2.png"/>
                   <pic:cNvPicPr preferRelativeResize="0"/>
                 </pic:nvPicPr>
                 <pic:blipFill>
@@ -17307,7 +17335,7 @@
 
 <file path=customXML/item1.xml><?xml version="1.0" encoding="utf-8"?>
 <go:gDocsCustomXmlDataStorage xmlns:go="http://customooxmlschemas.google.com/" xmlns:r="http://schemas.openxmlformats.org/officeDocument/2006/relationships" uri="GoogleDocsCustomDataVersion2">
-  <go:docsCustomData xmlns:go="http://customooxmlschemas.google.com/" roundtripDataSignature="AMtx7mjrSrOSyYR5tR9+2edjIs8sAGyU6w==">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</go:docsCustomData>
+  <go:docsCustomData xmlns:go="http://customooxmlschemas.google.com/" roundtripDataSignature="AMtx7mhrySFqg8RtYP88cld5P4DvMw0vmw==">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</go:docsCustomData>
 </go:gDocsCustomXmlDataStorage>
 </file>
 

</xml_diff>